<commit_message>
Upload “src/content/bios/De Boer-Y 2016.docx”
</commit_message>
<xml_diff>
--- a/src/content/bios/De Boer-Y 2016.docx
+++ b/src/content/bios/De Boer-Y 2016.docx
@@ -1,6 +1,6 @@
 
 <file path=word/document.xml><?xml version="1.0" encoding="utf-8"?>
-<w:document xmlns:wpc="http://schemas.microsoft.com/office/word/2010/wordprocessingCanvas" xmlns:cx="http://schemas.microsoft.com/office/drawing/2014/chartex" xmlns:cx1="http://schemas.microsoft.com/office/drawing/2015/9/8/chartex" xmlns:cx2="http://schemas.microsoft.com/office/drawing/2015/10/21/chartex" xmlns:cx3="http://schemas.microsoft.com/office/drawing/2016/5/9/chartex" xmlns:cx4="http://schemas.microsoft.com/office/drawing/2016/5/10/chartex" xmlns:cx5="http://schemas.microsoft.com/office/drawing/2016/5/11/chartex" xmlns:cx6="http://schemas.microsoft.com/office/drawing/2016/5/12/chartex" xmlns:cx7="http://schemas.microsoft.com/office/drawing/2016/5/13/chartex" xmlns:cx8="http://schemas.microsoft.com/office/drawing/2016/5/14/chartex" xmlns:mc="http://schemas.openxmlformats.org/markup-compatibility/2006" xmlns:aink="http://schemas.microsoft.com/office/drawing/2016/ink" xmlns:am3d="http://schemas.microsoft.com/office/drawing/2017/model3d" xmlns:o="urn:schemas-microsoft-com:office:office" xmlns:oel="http://schemas.microsoft.com/office/2019/extlst" xmlns:r="http://schemas.openxmlformats.org/officeDocument/2006/relationships" xmlns:m="http://schemas.openxmlformats.org/officeDocument/2006/math" xmlns:v="urn:schemas-microsoft-com:vml" xmlns:wp14="http://schemas.microsoft.com/office/word/2010/wordprocessingDrawing" xmlns:wp="http://schemas.openxmlformats.org/drawingml/2006/wordprocessingDrawing" xmlns:w10="urn:schemas-microsoft-com:office:word" xmlns:w="http://schemas.openxmlformats.org/wordprocessingml/2006/main" xmlns:w14="http://schemas.microsoft.com/office/word/2010/wordml" xmlns:w15="http://schemas.microsoft.com/office/word/2012/wordml" xmlns:w16cex="http://schemas.microsoft.com/office/word/2018/wordml/cex" xmlns:w16cid="http://schemas.microsoft.com/office/word/2016/wordml/cid" xmlns:w16="http://schemas.microsoft.com/office/word/2018/wordml" xmlns:w16du="http://schemas.microsoft.com/office/word/2023/wordml/word16du" xmlns:w16sdtdh="http://schemas.microsoft.com/office/word/2020/wordml/sdtdatahash" xmlns:w16sdtfl="http://schemas.microsoft.com/office/word/2024/wordml/sdtformatlock" xmlns:w16se="http://schemas.microsoft.com/office/word/2015/wordml/symex" xmlns:wpg="http://schemas.microsoft.com/office/word/2010/wordprocessingGroup" xmlns:wpi="http://schemas.microsoft.com/office/word/2010/wordprocessingInk" xmlns:wne="http://schemas.microsoft.com/office/word/2006/wordml" xmlns:wps="http://schemas.microsoft.com/office/word/2010/wordprocessingShape" mc:Ignorable="w14 w15 w16se w16cid w16 w16cex w16sdtdh w16sdtfl w16du wp14">
+<w:document xmlns:wpc="http://schemas.microsoft.com/office/word/2010/wordprocessingCanvas" xmlns:cx="http://schemas.microsoft.com/office/drawing/2014/chartex" xmlns:cx1="http://schemas.microsoft.com/office/drawing/2015/9/8/chartex" xmlns:cx2="http://schemas.microsoft.com/office/drawing/2015/10/21/chartex" xmlns:cx3="http://schemas.microsoft.com/office/drawing/2016/5/9/chartex" xmlns:cx4="http://schemas.microsoft.com/office/drawing/2016/5/10/chartex" xmlns:cx5="http://schemas.microsoft.com/office/drawing/2016/5/11/chartex" xmlns:cx6="http://schemas.microsoft.com/office/drawing/2016/5/12/chartex" xmlns:cx7="http://schemas.microsoft.com/office/drawing/2016/5/13/chartex" xmlns:cx8="http://schemas.microsoft.com/office/drawing/2016/5/14/chartex" xmlns:mc="http://schemas.openxmlformats.org/markup-compatibility/2006" xmlns:m="http://schemas.openxmlformats.org/officeDocument/2006/math" xmlns:aink="http://schemas.microsoft.com/office/drawing/2016/ink" xmlns:am3d="http://schemas.microsoft.com/office/drawing/2017/model3d" xmlns:oel="http://schemas.microsoft.com/office/2019/extlst" xmlns:r="http://schemas.openxmlformats.org/officeDocument/2006/relationships" xmlns:wp14="http://schemas.microsoft.com/office/word/2010/wordprocessingDrawing" xmlns:wp="http://schemas.openxmlformats.org/drawingml/2006/wordprocessingDrawing" xmlns:wpg="http://schemas.microsoft.com/office/word/2010/wordprocessingGroup" xmlns:wpi="http://schemas.microsoft.com/office/word/2010/wordprocessingInk" xmlns:wps="http://schemas.microsoft.com/office/word/2010/wordprocessingShape" xmlns:o="urn:schemas-microsoft-com:office:office" xmlns:v="urn:schemas-microsoft-com:vml" xmlns:w10="urn:schemas-microsoft-com:office:word" xmlns:w="http://schemas.openxmlformats.org/wordprocessingml/2006/main" xmlns:w14="http://schemas.microsoft.com/office/word/2010/wordml" xmlns:w15="http://schemas.microsoft.com/office/word/2012/wordml" xmlns:w16cei="http://schemas.microsoft.com/office/word/2026/wordml/cei" xmlns:w16cex="http://schemas.microsoft.com/office/word/2018/wordml/cex" xmlns:w16cid="http://schemas.microsoft.com/office/word/2016/wordml/cid" xmlns:w16="http://schemas.microsoft.com/office/word/2018/wordml" xmlns:w16sdtdh="http://schemas.microsoft.com/office/word/2020/wordml/sdtdatahash" xmlns:w16sdtfl="http://schemas.microsoft.com/office/word/2024/wordml/sdtformatlock" xmlns:w16se="http://schemas.microsoft.com/office/word/2015/wordml/symex" xmlns:w16du="http://schemas.microsoft.com/office/word/2023/wordml/word16du" xmlns:wne="http://schemas.microsoft.com/office/word/2006/wordml" mc:Ignorable="w14 w15 w16se w16cid w16 w16cex w16sdtdh w16sdtfl w16du wp14">
   <w:body>
     <w:p>
       <w:pPr>
@@ -433,18 +433,15 @@
         <w:rPr>
           <w:rFonts w:ascii="Times New Roman" w:eastAsia="Times New Roman" w:hAnsi="Times New Roman"/>
           <w:noProof/>
-          <w:color w:val="0000FF"/>
-          <w:sz w:val="24"/>
-          <w:szCs w:val="24"/>
-          <w:lang w:val="en-GB" w:eastAsia="nl-NL"/>
+          <w:sz w:val="24"/>
+          <w:szCs w:val="24"/>
+          <w:lang w:val="en-GB" w:eastAsia="de-DE"/>
         </w:rPr>
         <w:drawing>
-          <wp:inline distT="0" distB="0" distL="0" distR="0" wp14:anchorId="1D7FE379" wp14:editId="16C37BA5">
-            <wp:extent cx="3054350" cy="2078355"/>
-            <wp:effectExtent l="38100" t="38100" r="44450" b="42545"/>
-            <wp:docPr id="1" name="Bild 1" descr="http://www.iisd.ca/climate/sb32/pix/7june/DSC_7073%20yvo%20speak_s.jpg">
-              <a:hlinkClick xmlns:a="http://schemas.openxmlformats.org/drawingml/2006/main" r:id="rId7" invalidUrl="http://www.iisd.ca/climate/sb32/pix/7june/DSC_7073 yvo speak.jpg"/>
-            </wp:docPr>
+          <wp:inline distT="0" distB="0" distL="0" distR="0" wp14:anchorId="2718CB4B" wp14:editId="71ECE1B8">
+            <wp:extent cx="2531940" cy="1695311"/>
+            <wp:effectExtent l="0" t="0" r="0" b="0"/>
+            <wp:docPr id="1648872619" name="Afbeelding 1"/>
             <wp:cNvGraphicFramePr>
               <a:graphicFrameLocks xmlns:a="http://schemas.openxmlformats.org/drawingml/2006/main" noChangeAspect="1"/>
             </wp:cNvGraphicFramePr>
@@ -452,55 +449,29 @@
               <a:graphicData uri="http://schemas.openxmlformats.org/drawingml/2006/picture">
                 <pic:pic xmlns:pic="http://schemas.openxmlformats.org/drawingml/2006/picture">
                   <pic:nvPicPr>
-                    <pic:cNvPr id="0" name="Bild 1" descr="http://www.iisd.ca/climate/sb32/pix/7june/DSC_7073%20yvo%20speak_s.jpg"/>
-                    <pic:cNvPicPr>
-                      <a:picLocks noChangeAspect="1" noChangeArrowheads="1"/>
-                    </pic:cNvPicPr>
+                    <pic:cNvPr id="1648872619" name="Afbeelding 1648872619"/>
+                    <pic:cNvPicPr/>
                   </pic:nvPicPr>
-                  <pic:blipFill rotWithShape="1">
-                    <a:blip r:embed="rId8"/>
-                    <a:srcRect l="1000" t="1801" r="2799" b="-1"/>
-                    <a:stretch/>
+                  <pic:blipFill>
+                    <a:blip r:embed="rId7" cstate="print">
+                      <a:extLst>
+                        <a:ext uri="{28A0092B-C50C-407E-A947-70E740481C1C}">
+                          <a14:useLocalDpi xmlns:a14="http://schemas.microsoft.com/office/drawing/2010/main" val="0"/>
+                        </a:ext>
+                      </a:extLst>
+                    </a:blip>
+                    <a:stretch>
+                      <a:fillRect/>
+                    </a:stretch>
                   </pic:blipFill>
-                  <pic:spPr bwMode="auto">
+                  <pic:spPr>
                     <a:xfrm>
                       <a:off x="0" y="0"/>
-                      <a:ext cx="3054350" cy="2078355"/>
+                      <a:ext cx="2580978" cy="1728146"/>
                     </a:xfrm>
                     <a:prstGeom prst="rect">
                       <a:avLst/>
                     </a:prstGeom>
-                    <a:noFill/>
-                    <a:ln w="38100" cap="flat" cmpd="sng" algn="ctr">
-                      <a:solidFill>
-                        <a:srgbClr val="002060"/>
-                      </a:solidFill>
-                      <a:prstDash val="solid"/>
-                      <a:miter lim="800000"/>
-                      <a:headEnd type="none" w="med" len="med"/>
-                      <a:tailEnd type="none" w="med" len="med"/>
-                      <a:extLst>
-                        <a:ext uri="{C807C97D-BFC1-408E-A445-0C87EB9F89A2}">
-                          <ask:lineSketchStyleProps xmlns:ask="http://schemas.microsoft.com/office/drawing/2018/sketchyshapes" sd="0">
-                            <a:custGeom>
-                              <a:avLst/>
-                              <a:gdLst/>
-                              <a:ahLst/>
-                              <a:cxnLst/>
-                              <a:rect l="0" t="0" r="0" b="0"/>
-                              <a:pathLst/>
-                            </a:custGeom>
-                            <ask:type/>
-                          </ask:lineSketchStyleProps>
-                        </a:ext>
-                      </a:extLst>
-                    </a:ln>
-                    <a:effectLst/>
-                    <a:extLst>
-                      <a:ext uri="{53640926-AAD7-44D8-BBD7-CCE9431645EC}">
-                        <a14:shadowObscured xmlns:a14="http://schemas.microsoft.com/office/drawing/2010/main"/>
-                      </a:ext>
-                    </a:extLst>
                   </pic:spPr>
                 </pic:pic>
               </a:graphicData>
@@ -538,20 +509,15 @@
         </w:rPr>
         <w:t xml:space="preserve">: </w:t>
       </w:r>
-      <w:hyperlink r:id="rId9" w:history="1">
-        <w:r>
-          <w:rPr>
-            <w:rStyle w:val="Hyperlink"/>
-            <w:rFonts w:ascii="Times New Roman" w:hAnsi="Times New Roman"/>
-            <w:color w:val="0000FF"/>
-            <w:sz w:val="24"/>
-            <w:szCs w:val="24"/>
-            <w:u w:val="none"/>
-            <w:lang w:val="en-GB"/>
-          </w:rPr>
-          <w:t>www.iisd.ca/climate/sb32/7june.html</w:t>
-        </w:r>
-      </w:hyperlink>
+      <w:r>
+        <w:rPr>
+          <w:rFonts w:ascii="Times New Roman" w:hAnsi="Times New Roman"/>
+          <w:sz w:val="24"/>
+          <w:szCs w:val="24"/>
+          <w:lang w:val="en-GB"/>
+        </w:rPr>
+        <w:t>De Boer, UNFCCC in Copenhagen, 11 December 209, Flickr</w:t>
+      </w:r>
     </w:p>
     <w:p>
       <w:pPr>
@@ -2769,6 +2735,24 @@
           <w:szCs w:val="24"/>
           <w:lang w:val="en-GB"/>
         </w:rPr>
+        <w:t xml:space="preserve"> negotiator for the Netherlands</w:t>
+      </w:r>
+      <w:r>
+        <w:rPr>
+          <w:rFonts w:ascii="Times New Roman" w:hAnsi="Times New Roman"/>
+          <w:sz w:val="24"/>
+          <w:szCs w:val="24"/>
+          <w:lang w:val="en-GB"/>
+        </w:rPr>
+        <w:t>,</w:t>
+      </w:r>
+      <w:r>
+        <w:rPr>
+          <w:rFonts w:ascii="Times New Roman" w:hAnsi="Times New Roman"/>
+          <w:sz w:val="24"/>
+          <w:szCs w:val="24"/>
+          <w:lang w:val="en-GB"/>
+        </w:rPr>
         <w:t xml:space="preserve"> </w:t>
       </w:r>
       <w:r>
@@ -2778,250 +2762,223 @@
           <w:szCs w:val="24"/>
           <w:lang w:val="en-GB"/>
         </w:rPr>
+        <w:t xml:space="preserve">helped </w:t>
+      </w:r>
+      <w:r>
+        <w:rPr>
+          <w:rFonts w:ascii="Times New Roman" w:hAnsi="Times New Roman"/>
+          <w:sz w:val="24"/>
+          <w:szCs w:val="24"/>
+          <w:lang w:val="en-GB"/>
+        </w:rPr>
+        <w:t xml:space="preserve">to </w:t>
+      </w:r>
+      <w:r>
+        <w:rPr>
+          <w:rFonts w:ascii="Times New Roman" w:hAnsi="Times New Roman"/>
+          <w:sz w:val="24"/>
+          <w:szCs w:val="24"/>
+          <w:lang w:val="en-GB"/>
+        </w:rPr>
+        <w:t xml:space="preserve">prepare </w:t>
+      </w:r>
+      <w:r>
+        <w:rPr>
+          <w:rFonts w:ascii="Times New Roman" w:hAnsi="Times New Roman"/>
+          <w:sz w:val="24"/>
+          <w:szCs w:val="24"/>
+          <w:lang w:val="en-GB"/>
+        </w:rPr>
+        <w:t xml:space="preserve">the common position of </w:t>
+      </w:r>
+      <w:r>
+        <w:rPr>
+          <w:rFonts w:ascii="Times New Roman" w:hAnsi="Times New Roman"/>
+          <w:sz w:val="24"/>
+          <w:szCs w:val="24"/>
+          <w:lang w:val="en-GB"/>
+        </w:rPr>
+        <w:t xml:space="preserve">the </w:t>
+      </w:r>
+      <w:r>
+        <w:rPr>
+          <w:rFonts w:ascii="Times New Roman" w:hAnsi="Times New Roman"/>
+          <w:sz w:val="24"/>
+          <w:szCs w:val="24"/>
+          <w:lang w:val="en-GB"/>
+        </w:rPr>
+        <w:t xml:space="preserve">member states of the </w:t>
+      </w:r>
+      <w:r>
+        <w:rPr>
+          <w:rFonts w:ascii="Times New Roman" w:hAnsi="Times New Roman"/>
+          <w:sz w:val="24"/>
+          <w:szCs w:val="24"/>
+          <w:lang w:val="en-GB"/>
+        </w:rPr>
+        <w:t xml:space="preserve">European Union (EU) </w:t>
+      </w:r>
+      <w:r>
+        <w:rPr>
+          <w:rFonts w:ascii="Times New Roman" w:hAnsi="Times New Roman"/>
+          <w:sz w:val="24"/>
+          <w:szCs w:val="24"/>
+          <w:lang w:val="en-GB"/>
+        </w:rPr>
+        <w:t>in</w:t>
+      </w:r>
+      <w:r>
+        <w:rPr>
+          <w:rFonts w:ascii="Times New Roman" w:hAnsi="Times New Roman"/>
+          <w:sz w:val="24"/>
+          <w:szCs w:val="24"/>
+          <w:lang w:val="en-GB"/>
+        </w:rPr>
+        <w:t xml:space="preserve"> the international climate negotiations </w:t>
+      </w:r>
+      <w:r>
+        <w:rPr>
+          <w:rFonts w:ascii="Times New Roman" w:hAnsi="Times New Roman"/>
+          <w:sz w:val="24"/>
+          <w:szCs w:val="24"/>
+          <w:lang w:val="en-GB"/>
+        </w:rPr>
+        <w:t xml:space="preserve">that </w:t>
+      </w:r>
+      <w:r>
+        <w:rPr>
+          <w:rFonts w:ascii="Times New Roman" w:hAnsi="Times New Roman"/>
+          <w:sz w:val="24"/>
+          <w:szCs w:val="24"/>
+          <w:lang w:val="en-GB"/>
+        </w:rPr>
+        <w:t xml:space="preserve">culminated </w:t>
+      </w:r>
+      <w:r>
+        <w:rPr>
+          <w:rFonts w:ascii="Times New Roman" w:hAnsi="Times New Roman"/>
+          <w:sz w:val="24"/>
+          <w:szCs w:val="24"/>
+          <w:lang w:val="en-GB"/>
+        </w:rPr>
+        <w:t xml:space="preserve">in the </w:t>
+      </w:r>
+      <w:r>
+        <w:rPr>
+          <w:rFonts w:ascii="Times New Roman" w:hAnsi="Times New Roman"/>
+          <w:sz w:val="24"/>
+          <w:szCs w:val="24"/>
+          <w:lang w:val="en-GB"/>
+        </w:rPr>
+        <w:t xml:space="preserve">adoption of the </w:t>
+      </w:r>
+      <w:r>
+        <w:rPr>
+          <w:rFonts w:ascii="Times New Roman" w:hAnsi="Times New Roman"/>
+          <w:sz w:val="24"/>
+          <w:szCs w:val="24"/>
+          <w:lang w:val="en-GB"/>
+        </w:rPr>
+        <w:t xml:space="preserve">Kyoto Protocol </w:t>
+      </w:r>
+      <w:r>
+        <w:rPr>
+          <w:rFonts w:ascii="Times New Roman" w:hAnsi="Times New Roman"/>
+          <w:sz w:val="24"/>
+          <w:szCs w:val="24"/>
+          <w:lang w:val="en-GB"/>
+        </w:rPr>
+        <w:t>in December 1997</w:t>
+      </w:r>
+      <w:r>
+        <w:rPr>
+          <w:rFonts w:ascii="Times New Roman" w:hAnsi="Times New Roman"/>
+          <w:sz w:val="24"/>
+          <w:szCs w:val="24"/>
+          <w:lang w:val="en-GB"/>
+        </w:rPr>
+        <w:t>.</w:t>
+      </w:r>
+      <w:r>
+        <w:rPr>
+          <w:rFonts w:ascii="Times New Roman" w:hAnsi="Times New Roman"/>
+          <w:sz w:val="24"/>
+          <w:szCs w:val="24"/>
+          <w:lang w:val="en-GB"/>
+        </w:rPr>
+        <w:t xml:space="preserve"> </w:t>
+      </w:r>
+      <w:r>
+        <w:rPr>
+          <w:rFonts w:ascii="Times New Roman" w:hAnsi="Times New Roman"/>
+          <w:sz w:val="24"/>
+          <w:szCs w:val="24"/>
+          <w:lang w:val="en-GB"/>
+        </w:rPr>
+        <w:t>H</w:t>
+      </w:r>
+      <w:r>
+        <w:rPr>
+          <w:rFonts w:ascii="Times New Roman" w:hAnsi="Times New Roman"/>
+          <w:sz w:val="24"/>
+          <w:szCs w:val="24"/>
+          <w:lang w:val="en-GB"/>
+        </w:rPr>
+        <w:t xml:space="preserve">e </w:t>
+      </w:r>
+      <w:r>
+        <w:rPr>
+          <w:rFonts w:ascii="Times New Roman" w:hAnsi="Times New Roman"/>
+          <w:sz w:val="24"/>
+          <w:szCs w:val="24"/>
+          <w:lang w:val="en-GB"/>
+        </w:rPr>
+        <w:t xml:space="preserve">was </w:t>
+      </w:r>
+      <w:r>
+        <w:rPr>
+          <w:rFonts w:ascii="Times New Roman" w:hAnsi="Times New Roman"/>
+          <w:sz w:val="24"/>
+          <w:szCs w:val="24"/>
+          <w:lang w:val="en-GB"/>
+        </w:rPr>
+        <w:t xml:space="preserve">also </w:t>
+      </w:r>
+      <w:r>
+        <w:rPr>
+          <w:rFonts w:ascii="Times New Roman" w:hAnsi="Times New Roman"/>
+          <w:sz w:val="24"/>
+          <w:szCs w:val="24"/>
+          <w:lang w:val="en-GB"/>
+        </w:rPr>
+        <w:t xml:space="preserve">engaged </w:t>
+      </w:r>
+      <w:r>
+        <w:rPr>
+          <w:rFonts w:ascii="Times New Roman" w:hAnsi="Times New Roman"/>
+          <w:sz w:val="24"/>
+          <w:szCs w:val="24"/>
+          <w:lang w:val="en-GB"/>
+        </w:rPr>
+        <w:t>in the des</w:t>
+      </w:r>
+      <w:r>
+        <w:rPr>
+          <w:rFonts w:ascii="Times New Roman" w:hAnsi="Times New Roman"/>
+          <w:sz w:val="24"/>
+          <w:szCs w:val="24"/>
+          <w:lang w:val="en-GB"/>
+        </w:rPr>
+        <w:t xml:space="preserve">ign of the </w:t>
+      </w:r>
+      <w:r>
+        <w:rPr>
+          <w:rFonts w:ascii="Times New Roman" w:hAnsi="Times New Roman"/>
+          <w:sz w:val="24"/>
+          <w:szCs w:val="24"/>
+          <w:lang w:val="en-GB"/>
+        </w:rPr>
         <w:lastRenderedPageBreak/>
-        <w:t>negotiator for the Netherlands</w:t>
-      </w:r>
-      <w:r>
-        <w:rPr>
-          <w:rFonts w:ascii="Times New Roman" w:hAnsi="Times New Roman"/>
-          <w:sz w:val="24"/>
-          <w:szCs w:val="24"/>
-          <w:lang w:val="en-GB"/>
-        </w:rPr>
-        <w:t>,</w:t>
-      </w:r>
-      <w:r>
-        <w:rPr>
-          <w:rFonts w:ascii="Times New Roman" w:hAnsi="Times New Roman"/>
-          <w:sz w:val="24"/>
-          <w:szCs w:val="24"/>
-          <w:lang w:val="en-GB"/>
-        </w:rPr>
-        <w:t xml:space="preserve"> </w:t>
-      </w:r>
-      <w:r>
-        <w:rPr>
-          <w:rFonts w:ascii="Times New Roman" w:hAnsi="Times New Roman"/>
-          <w:sz w:val="24"/>
-          <w:szCs w:val="24"/>
-          <w:lang w:val="en-GB"/>
-        </w:rPr>
-        <w:t xml:space="preserve">helped </w:t>
-      </w:r>
-      <w:r>
-        <w:rPr>
-          <w:rFonts w:ascii="Times New Roman" w:hAnsi="Times New Roman"/>
-          <w:sz w:val="24"/>
-          <w:szCs w:val="24"/>
-          <w:lang w:val="en-GB"/>
-        </w:rPr>
-        <w:t xml:space="preserve">to </w:t>
-      </w:r>
-      <w:r>
-        <w:rPr>
-          <w:rFonts w:ascii="Times New Roman" w:hAnsi="Times New Roman"/>
-          <w:sz w:val="24"/>
-          <w:szCs w:val="24"/>
-          <w:lang w:val="en-GB"/>
-        </w:rPr>
-        <w:t xml:space="preserve">prepare </w:t>
-      </w:r>
-      <w:r>
-        <w:rPr>
-          <w:rFonts w:ascii="Times New Roman" w:hAnsi="Times New Roman"/>
-          <w:sz w:val="24"/>
-          <w:szCs w:val="24"/>
-          <w:lang w:val="en-GB"/>
-        </w:rPr>
-        <w:t xml:space="preserve">the common position of </w:t>
-      </w:r>
-      <w:r>
-        <w:rPr>
-          <w:rFonts w:ascii="Times New Roman" w:hAnsi="Times New Roman"/>
-          <w:sz w:val="24"/>
-          <w:szCs w:val="24"/>
-          <w:lang w:val="en-GB"/>
-        </w:rPr>
-        <w:t xml:space="preserve">the </w:t>
-      </w:r>
-      <w:r>
-        <w:rPr>
-          <w:rFonts w:ascii="Times New Roman" w:hAnsi="Times New Roman"/>
-          <w:sz w:val="24"/>
-          <w:szCs w:val="24"/>
-          <w:lang w:val="en-GB"/>
-        </w:rPr>
-        <w:t xml:space="preserve">member states of the </w:t>
-      </w:r>
-      <w:r>
-        <w:rPr>
-          <w:rFonts w:ascii="Times New Roman" w:hAnsi="Times New Roman"/>
-          <w:sz w:val="24"/>
-          <w:szCs w:val="24"/>
-          <w:lang w:val="en-GB"/>
-        </w:rPr>
-        <w:t xml:space="preserve">European Union (EU) </w:t>
-      </w:r>
-      <w:r>
-        <w:rPr>
-          <w:rFonts w:ascii="Times New Roman" w:hAnsi="Times New Roman"/>
-          <w:sz w:val="24"/>
-          <w:szCs w:val="24"/>
-          <w:lang w:val="en-GB"/>
-        </w:rPr>
-        <w:t>in</w:t>
-      </w:r>
-      <w:r>
-        <w:rPr>
-          <w:rFonts w:ascii="Times New Roman" w:hAnsi="Times New Roman"/>
-          <w:sz w:val="24"/>
-          <w:szCs w:val="24"/>
-          <w:lang w:val="en-GB"/>
-        </w:rPr>
-        <w:t xml:space="preserve"> the international climate negotiations </w:t>
-      </w:r>
-      <w:r>
-        <w:rPr>
-          <w:rFonts w:ascii="Times New Roman" w:hAnsi="Times New Roman"/>
-          <w:sz w:val="24"/>
-          <w:szCs w:val="24"/>
-          <w:lang w:val="en-GB"/>
-        </w:rPr>
-        <w:t xml:space="preserve">that </w:t>
-      </w:r>
-      <w:r>
-        <w:rPr>
-          <w:rFonts w:ascii="Times New Roman" w:hAnsi="Times New Roman"/>
-          <w:sz w:val="24"/>
-          <w:szCs w:val="24"/>
-          <w:lang w:val="en-GB"/>
-        </w:rPr>
-        <w:t xml:space="preserve">culminated </w:t>
-      </w:r>
-      <w:r>
-        <w:rPr>
-          <w:rFonts w:ascii="Times New Roman" w:hAnsi="Times New Roman"/>
-          <w:sz w:val="24"/>
-          <w:szCs w:val="24"/>
-          <w:lang w:val="en-GB"/>
-        </w:rPr>
-        <w:t xml:space="preserve">in the </w:t>
-      </w:r>
-      <w:r>
-        <w:rPr>
-          <w:rFonts w:ascii="Times New Roman" w:hAnsi="Times New Roman"/>
-          <w:sz w:val="24"/>
-          <w:szCs w:val="24"/>
-          <w:lang w:val="en-GB"/>
-        </w:rPr>
-        <w:t xml:space="preserve">adoption of the </w:t>
-      </w:r>
-      <w:r>
-        <w:rPr>
-          <w:rFonts w:ascii="Times New Roman" w:hAnsi="Times New Roman"/>
-          <w:sz w:val="24"/>
-          <w:szCs w:val="24"/>
-          <w:lang w:val="en-GB"/>
-        </w:rPr>
-        <w:t xml:space="preserve">Kyoto Protocol </w:t>
-      </w:r>
-      <w:r>
-        <w:rPr>
-          <w:rFonts w:ascii="Times New Roman" w:hAnsi="Times New Roman"/>
-          <w:sz w:val="24"/>
-          <w:szCs w:val="24"/>
-          <w:lang w:val="en-GB"/>
-        </w:rPr>
-        <w:t>in December 1997</w:t>
-      </w:r>
-      <w:r>
-        <w:rPr>
-          <w:rFonts w:ascii="Times New Roman" w:hAnsi="Times New Roman"/>
-          <w:sz w:val="24"/>
-          <w:szCs w:val="24"/>
-          <w:lang w:val="en-GB"/>
-        </w:rPr>
-        <w:t>.</w:t>
-      </w:r>
-      <w:r>
-        <w:rPr>
-          <w:rFonts w:ascii="Times New Roman" w:hAnsi="Times New Roman"/>
-          <w:sz w:val="24"/>
-          <w:szCs w:val="24"/>
-          <w:lang w:val="en-GB"/>
-        </w:rPr>
-        <w:t xml:space="preserve"> </w:t>
-      </w:r>
-      <w:r>
-        <w:rPr>
-          <w:rFonts w:ascii="Times New Roman" w:hAnsi="Times New Roman"/>
-          <w:sz w:val="24"/>
-          <w:szCs w:val="24"/>
-          <w:lang w:val="en-GB"/>
-        </w:rPr>
-        <w:t>H</w:t>
-      </w:r>
-      <w:r>
-        <w:rPr>
-          <w:rFonts w:ascii="Times New Roman" w:hAnsi="Times New Roman"/>
-          <w:sz w:val="24"/>
-          <w:szCs w:val="24"/>
-          <w:lang w:val="en-GB"/>
-        </w:rPr>
-        <w:t xml:space="preserve">e </w:t>
-      </w:r>
-      <w:r>
-        <w:rPr>
-          <w:rFonts w:ascii="Times New Roman" w:hAnsi="Times New Roman"/>
-          <w:sz w:val="24"/>
-          <w:szCs w:val="24"/>
-          <w:lang w:val="en-GB"/>
-        </w:rPr>
-        <w:t xml:space="preserve">was </w:t>
-      </w:r>
-      <w:r>
-        <w:rPr>
-          <w:rFonts w:ascii="Times New Roman" w:hAnsi="Times New Roman"/>
-          <w:sz w:val="24"/>
-          <w:szCs w:val="24"/>
-          <w:lang w:val="en-GB"/>
-        </w:rPr>
-        <w:t xml:space="preserve">also </w:t>
-      </w:r>
-      <w:r>
-        <w:rPr>
-          <w:rFonts w:ascii="Times New Roman" w:hAnsi="Times New Roman"/>
-          <w:sz w:val="24"/>
-          <w:szCs w:val="24"/>
-          <w:lang w:val="en-GB"/>
-        </w:rPr>
-        <w:t xml:space="preserve">engaged </w:t>
-      </w:r>
-      <w:r>
-        <w:rPr>
-          <w:rFonts w:ascii="Times New Roman" w:hAnsi="Times New Roman"/>
-          <w:sz w:val="24"/>
-          <w:szCs w:val="24"/>
-          <w:lang w:val="en-GB"/>
-        </w:rPr>
-        <w:t>in the des</w:t>
-      </w:r>
-      <w:r>
-        <w:rPr>
-          <w:rFonts w:ascii="Times New Roman" w:hAnsi="Times New Roman"/>
-          <w:sz w:val="24"/>
-          <w:szCs w:val="24"/>
-          <w:lang w:val="en-GB"/>
-        </w:rPr>
-        <w:t xml:space="preserve">ign of the </w:t>
-      </w:r>
-      <w:r>
-        <w:rPr>
-          <w:rFonts w:ascii="Times New Roman" w:hAnsi="Times New Roman"/>
-          <w:sz w:val="24"/>
-          <w:szCs w:val="24"/>
-          <w:lang w:val="en-GB"/>
-        </w:rPr>
         <w:t>EU</w:t>
       </w:r>
       <w:r>
@@ -5787,143 +5744,152 @@
           <w:szCs w:val="24"/>
           <w:lang w:val="en-GB"/>
         </w:rPr>
+        <w:t>Kyoto Protocol.</w:t>
+      </w:r>
+      <w:r>
+        <w:rPr>
+          <w:rFonts w:ascii="Times New Roman" w:hAnsi="Times New Roman"/>
+          <w:sz w:val="24"/>
+          <w:szCs w:val="24"/>
+          <w:lang w:val="en-GB"/>
+        </w:rPr>
+        <w:t xml:space="preserve"> However, a</w:t>
+      </w:r>
+      <w:r>
+        <w:rPr>
+          <w:rFonts w:ascii="Times New Roman" w:hAnsi="Times New Roman"/>
+          <w:sz w:val="24"/>
+          <w:szCs w:val="24"/>
+          <w:lang w:val="en-GB"/>
+        </w:rPr>
+        <w:t>fter difficult negotiations and working for days with little or no s</w:t>
+      </w:r>
+      <w:r>
+        <w:rPr>
+          <w:rFonts w:ascii="Times New Roman" w:hAnsi="Times New Roman"/>
+          <w:sz w:val="24"/>
+          <w:szCs w:val="24"/>
+          <w:lang w:val="en-GB"/>
+        </w:rPr>
+        <w:t>leep, the talks stalled due to repeated</w:t>
+      </w:r>
+      <w:r>
+        <w:rPr>
+          <w:rFonts w:ascii="Times New Roman" w:hAnsi="Times New Roman"/>
+          <w:sz w:val="24"/>
+          <w:szCs w:val="24"/>
+          <w:lang w:val="en-GB"/>
+        </w:rPr>
+        <w:t xml:space="preserve"> squabbling over proposals </w:t>
+      </w:r>
+      <w:r>
+        <w:rPr>
+          <w:rFonts w:ascii="Times New Roman" w:hAnsi="Times New Roman"/>
+          <w:sz w:val="24"/>
+          <w:szCs w:val="24"/>
+          <w:lang w:val="en-GB"/>
+        </w:rPr>
+        <w:t xml:space="preserve">on </w:t>
+      </w:r>
+      <w:r>
+        <w:rPr>
+          <w:rFonts w:ascii="Times New Roman" w:hAnsi="Times New Roman"/>
+          <w:sz w:val="24"/>
+          <w:szCs w:val="24"/>
+          <w:lang w:val="en-GB"/>
+        </w:rPr>
+        <w:t xml:space="preserve">how to </w:t>
+      </w:r>
+      <w:r>
+        <w:rPr>
+          <w:rFonts w:ascii="Times New Roman" w:hAnsi="Times New Roman"/>
+          <w:sz w:val="24"/>
+          <w:szCs w:val="24"/>
+          <w:lang w:val="en-GB"/>
+        </w:rPr>
+        <w:t xml:space="preserve">limit </w:t>
+      </w:r>
+      <w:r>
+        <w:rPr>
+          <w:rFonts w:ascii="Times New Roman" w:hAnsi="Times New Roman"/>
+          <w:sz w:val="24"/>
+          <w:szCs w:val="24"/>
+          <w:lang w:val="en-GB"/>
+        </w:rPr>
+        <w:t xml:space="preserve">global </w:t>
+      </w:r>
+      <w:r>
+        <w:rPr>
+          <w:rFonts w:ascii="Times New Roman" w:hAnsi="Times New Roman"/>
+          <w:sz w:val="24"/>
+          <w:szCs w:val="24"/>
+          <w:lang w:val="en-GB"/>
+        </w:rPr>
+        <w:t xml:space="preserve">greenhouse gas </w:t>
+      </w:r>
+      <w:r>
+        <w:rPr>
+          <w:rFonts w:ascii="Times New Roman" w:hAnsi="Times New Roman"/>
+          <w:sz w:val="24"/>
+          <w:szCs w:val="24"/>
+          <w:lang w:val="en-GB"/>
+        </w:rPr>
+        <w:t>e</w:t>
+      </w:r>
+      <w:r>
+        <w:rPr>
+          <w:rFonts w:ascii="Times New Roman" w:hAnsi="Times New Roman"/>
+          <w:sz w:val="24"/>
+          <w:szCs w:val="24"/>
+          <w:lang w:val="en-GB"/>
+        </w:rPr>
+        <w:t>missions. Canada, Japan, Russia</w:t>
+      </w:r>
+      <w:r>
+        <w:rPr>
+          <w:rFonts w:ascii="Times New Roman" w:hAnsi="Times New Roman"/>
+          <w:sz w:val="24"/>
+          <w:szCs w:val="24"/>
+          <w:lang w:val="en-GB"/>
+        </w:rPr>
+        <w:t xml:space="preserve"> and the United States</w:t>
+      </w:r>
+      <w:r>
+        <w:rPr>
+          <w:rFonts w:ascii="Times New Roman" w:hAnsi="Times New Roman"/>
+          <w:sz w:val="24"/>
+          <w:szCs w:val="24"/>
+          <w:lang w:val="en-GB"/>
+        </w:rPr>
+        <w:t xml:space="preserve"> </w:t>
+      </w:r>
+      <w:r>
+        <w:rPr>
+          <w:rFonts w:ascii="Times New Roman" w:hAnsi="Times New Roman"/>
+          <w:sz w:val="24"/>
+          <w:szCs w:val="24"/>
+          <w:lang w:val="en-GB"/>
+        </w:rPr>
+        <w:t xml:space="preserve">(US) </w:t>
+      </w:r>
+      <w:r>
+        <w:rPr>
+          <w:rFonts w:ascii="Times New Roman" w:hAnsi="Times New Roman"/>
+          <w:sz w:val="24"/>
+          <w:szCs w:val="24"/>
+          <w:lang w:val="en-GB"/>
+        </w:rPr>
+        <w:t xml:space="preserve">rejected some of </w:t>
+      </w:r>
+      <w:r>
+        <w:rPr>
+          <w:rFonts w:ascii="Times New Roman" w:hAnsi="Times New Roman"/>
+          <w:sz w:val="24"/>
+          <w:szCs w:val="24"/>
+          <w:lang w:val="en-GB"/>
+        </w:rPr>
         <w:lastRenderedPageBreak/>
-        <w:t>Kyoto Protocol.</w:t>
-      </w:r>
-      <w:r>
-        <w:rPr>
-          <w:rFonts w:ascii="Times New Roman" w:hAnsi="Times New Roman"/>
-          <w:sz w:val="24"/>
-          <w:szCs w:val="24"/>
-          <w:lang w:val="en-GB"/>
-        </w:rPr>
-        <w:t xml:space="preserve"> However, a</w:t>
-      </w:r>
-      <w:r>
-        <w:rPr>
-          <w:rFonts w:ascii="Times New Roman" w:hAnsi="Times New Roman"/>
-          <w:sz w:val="24"/>
-          <w:szCs w:val="24"/>
-          <w:lang w:val="en-GB"/>
-        </w:rPr>
-        <w:t>fter difficult negotiations and working for days with little or no s</w:t>
-      </w:r>
-      <w:r>
-        <w:rPr>
-          <w:rFonts w:ascii="Times New Roman" w:hAnsi="Times New Roman"/>
-          <w:sz w:val="24"/>
-          <w:szCs w:val="24"/>
-          <w:lang w:val="en-GB"/>
-        </w:rPr>
-        <w:t>leep, the talks stalled due to repeated</w:t>
-      </w:r>
-      <w:r>
-        <w:rPr>
-          <w:rFonts w:ascii="Times New Roman" w:hAnsi="Times New Roman"/>
-          <w:sz w:val="24"/>
-          <w:szCs w:val="24"/>
-          <w:lang w:val="en-GB"/>
-        </w:rPr>
-        <w:t xml:space="preserve"> squabbling over proposals </w:t>
-      </w:r>
-      <w:r>
-        <w:rPr>
-          <w:rFonts w:ascii="Times New Roman" w:hAnsi="Times New Roman"/>
-          <w:sz w:val="24"/>
-          <w:szCs w:val="24"/>
-          <w:lang w:val="en-GB"/>
-        </w:rPr>
-        <w:t xml:space="preserve">on </w:t>
-      </w:r>
-      <w:r>
-        <w:rPr>
-          <w:rFonts w:ascii="Times New Roman" w:hAnsi="Times New Roman"/>
-          <w:sz w:val="24"/>
-          <w:szCs w:val="24"/>
-          <w:lang w:val="en-GB"/>
-        </w:rPr>
-        <w:t xml:space="preserve">how to </w:t>
-      </w:r>
-      <w:r>
-        <w:rPr>
-          <w:rFonts w:ascii="Times New Roman" w:hAnsi="Times New Roman"/>
-          <w:sz w:val="24"/>
-          <w:szCs w:val="24"/>
-          <w:lang w:val="en-GB"/>
-        </w:rPr>
-        <w:t xml:space="preserve">limit </w:t>
-      </w:r>
-      <w:r>
-        <w:rPr>
-          <w:rFonts w:ascii="Times New Roman" w:hAnsi="Times New Roman"/>
-          <w:sz w:val="24"/>
-          <w:szCs w:val="24"/>
-          <w:lang w:val="en-GB"/>
-        </w:rPr>
-        <w:t xml:space="preserve">global </w:t>
-      </w:r>
-      <w:r>
-        <w:rPr>
-          <w:rFonts w:ascii="Times New Roman" w:hAnsi="Times New Roman"/>
-          <w:sz w:val="24"/>
-          <w:szCs w:val="24"/>
-          <w:lang w:val="en-GB"/>
-        </w:rPr>
-        <w:t xml:space="preserve">greenhouse gas </w:t>
-      </w:r>
-      <w:r>
-        <w:rPr>
-          <w:rFonts w:ascii="Times New Roman" w:hAnsi="Times New Roman"/>
-          <w:sz w:val="24"/>
-          <w:szCs w:val="24"/>
-          <w:lang w:val="en-GB"/>
-        </w:rPr>
-        <w:t>e</w:t>
-      </w:r>
-      <w:r>
-        <w:rPr>
-          <w:rFonts w:ascii="Times New Roman" w:hAnsi="Times New Roman"/>
-          <w:sz w:val="24"/>
-          <w:szCs w:val="24"/>
-          <w:lang w:val="en-GB"/>
-        </w:rPr>
-        <w:t>missions. Canada, Japan, Russia</w:t>
-      </w:r>
-      <w:r>
-        <w:rPr>
-          <w:rFonts w:ascii="Times New Roman" w:hAnsi="Times New Roman"/>
-          <w:sz w:val="24"/>
-          <w:szCs w:val="24"/>
-          <w:lang w:val="en-GB"/>
-        </w:rPr>
-        <w:t xml:space="preserve"> and the United States</w:t>
-      </w:r>
-      <w:r>
-        <w:rPr>
-          <w:rFonts w:ascii="Times New Roman" w:hAnsi="Times New Roman"/>
-          <w:sz w:val="24"/>
-          <w:szCs w:val="24"/>
-          <w:lang w:val="en-GB"/>
-        </w:rPr>
-        <w:t xml:space="preserve"> </w:t>
-      </w:r>
-      <w:r>
-        <w:rPr>
-          <w:rFonts w:ascii="Times New Roman" w:hAnsi="Times New Roman"/>
-          <w:sz w:val="24"/>
-          <w:szCs w:val="24"/>
-          <w:lang w:val="en-GB"/>
-        </w:rPr>
-        <w:t xml:space="preserve">(US) </w:t>
-      </w:r>
-      <w:r>
-        <w:rPr>
-          <w:rFonts w:ascii="Times New Roman" w:hAnsi="Times New Roman"/>
-          <w:sz w:val="24"/>
-          <w:szCs w:val="24"/>
-          <w:lang w:val="en-GB"/>
-        </w:rPr>
-        <w:t xml:space="preserve">rejected some of the key </w:t>
+        <w:t xml:space="preserve">the key </w:t>
       </w:r>
       <w:r>
         <w:rPr>
@@ -8661,7 +8627,151 @@
           <w:szCs w:val="24"/>
           <w:lang w:val="en-GB"/>
         </w:rPr>
-        <w:t xml:space="preserve">must come </w:t>
+        <w:t xml:space="preserve">must come from businesses, </w:t>
+      </w:r>
+      <w:r>
+        <w:rPr>
+          <w:rFonts w:ascii="Times New Roman" w:hAnsi="Times New Roman"/>
+          <w:sz w:val="24"/>
+          <w:szCs w:val="24"/>
+          <w:lang w:val="en-GB"/>
+        </w:rPr>
+        <w:t>De Boer</w:t>
+      </w:r>
+      <w:r>
+        <w:rPr>
+          <w:rFonts w:ascii="Times New Roman" w:hAnsi="Times New Roman"/>
+          <w:sz w:val="24"/>
+          <w:szCs w:val="24"/>
+          <w:lang w:val="en-GB"/>
+        </w:rPr>
+        <w:t xml:space="preserve"> decided to work on climate and sustainability issues </w:t>
+      </w:r>
+      <w:r>
+        <w:rPr>
+          <w:rFonts w:ascii="Times New Roman" w:hAnsi="Times New Roman"/>
+          <w:sz w:val="24"/>
+          <w:szCs w:val="24"/>
+          <w:lang w:val="en-GB"/>
+        </w:rPr>
+        <w:t>from</w:t>
+      </w:r>
+      <w:r>
+        <w:rPr>
+          <w:rFonts w:ascii="Times New Roman" w:hAnsi="Times New Roman"/>
+          <w:sz w:val="24"/>
+          <w:szCs w:val="24"/>
+          <w:lang w:val="en-GB"/>
+        </w:rPr>
+        <w:t xml:space="preserve"> </w:t>
+      </w:r>
+      <w:r>
+        <w:rPr>
+          <w:rFonts w:ascii="Times New Roman" w:hAnsi="Times New Roman"/>
+          <w:sz w:val="24"/>
+          <w:szCs w:val="24"/>
+          <w:lang w:val="en-GB"/>
+        </w:rPr>
+        <w:t xml:space="preserve">the perspective of </w:t>
+      </w:r>
+      <w:r>
+        <w:rPr>
+          <w:rFonts w:ascii="Times New Roman" w:hAnsi="Times New Roman"/>
+          <w:sz w:val="24"/>
+          <w:szCs w:val="24"/>
+          <w:lang w:val="en-GB"/>
+        </w:rPr>
+        <w:t>the private sector. After his resignation</w:t>
+      </w:r>
+      <w:r>
+        <w:rPr>
+          <w:rFonts w:ascii="Times New Roman" w:hAnsi="Times New Roman"/>
+          <w:sz w:val="24"/>
+          <w:szCs w:val="24"/>
+          <w:lang w:val="en-GB"/>
+        </w:rPr>
+        <w:t xml:space="preserve"> </w:t>
+      </w:r>
+      <w:r>
+        <w:rPr>
+          <w:rFonts w:ascii="Times New Roman" w:hAnsi="Times New Roman"/>
+          <w:sz w:val="24"/>
+          <w:szCs w:val="24"/>
+          <w:lang w:val="en-GB"/>
+        </w:rPr>
+        <w:t xml:space="preserve">he worked as </w:t>
+      </w:r>
+      <w:r>
+        <w:rPr>
+          <w:rFonts w:ascii="Times New Roman" w:hAnsi="Times New Roman"/>
+          <w:sz w:val="24"/>
+          <w:szCs w:val="24"/>
+          <w:lang w:val="en-GB"/>
+        </w:rPr>
+        <w:t xml:space="preserve">Special </w:t>
+      </w:r>
+      <w:r>
+        <w:rPr>
+          <w:rFonts w:ascii="Times New Roman" w:hAnsi="Times New Roman"/>
+          <w:sz w:val="24"/>
+          <w:szCs w:val="24"/>
+          <w:lang w:val="en-GB"/>
+        </w:rPr>
+        <w:t xml:space="preserve">Global </w:t>
+      </w:r>
+      <w:r>
+        <w:rPr>
+          <w:rFonts w:ascii="Times New Roman" w:hAnsi="Times New Roman"/>
+          <w:sz w:val="24"/>
+          <w:szCs w:val="24"/>
+          <w:lang w:val="en-GB"/>
+        </w:rPr>
+        <w:t xml:space="preserve">Advisor on </w:t>
+      </w:r>
+      <w:r>
+        <w:rPr>
+          <w:rFonts w:ascii="Times New Roman" w:hAnsi="Times New Roman"/>
+          <w:sz w:val="24"/>
+          <w:szCs w:val="24"/>
+          <w:lang w:val="en-GB"/>
+        </w:rPr>
+        <w:t xml:space="preserve">Climate Change and Sustainability at </w:t>
+      </w:r>
+      <w:r>
+        <w:rPr>
+          <w:rFonts w:ascii="Times New Roman" w:hAnsi="Times New Roman"/>
+          <w:sz w:val="24"/>
+          <w:szCs w:val="24"/>
+          <w:lang w:val="en-GB"/>
+        </w:rPr>
+        <w:t xml:space="preserve">the global auditing firm KPMG from </w:t>
+      </w:r>
+      <w:r>
+        <w:rPr>
+          <w:rFonts w:ascii="Times New Roman" w:hAnsi="Times New Roman"/>
+          <w:sz w:val="24"/>
+          <w:szCs w:val="24"/>
+          <w:lang w:val="en-GB"/>
+        </w:rPr>
+        <w:t xml:space="preserve">July </w:t>
+      </w:r>
+      <w:r>
+        <w:rPr>
+          <w:rFonts w:ascii="Times New Roman" w:hAnsi="Times New Roman"/>
+          <w:sz w:val="24"/>
+          <w:szCs w:val="24"/>
+          <w:lang w:val="en-GB"/>
+        </w:rPr>
+        <w:t xml:space="preserve">2010 to </w:t>
+      </w:r>
+      <w:r>
+        <w:rPr>
+          <w:rFonts w:ascii="Times New Roman" w:hAnsi="Times New Roman"/>
+          <w:sz w:val="24"/>
+          <w:szCs w:val="24"/>
+          <w:lang w:val="en-GB"/>
+        </w:rPr>
+        <w:t xml:space="preserve">May </w:t>
       </w:r>
       <w:r>
         <w:rPr>
@@ -8671,159 +8781,6 @@
           <w:lang w:val="en-GB"/>
         </w:rPr>
         <w:lastRenderedPageBreak/>
-        <w:t xml:space="preserve">from businesses, </w:t>
-      </w:r>
-      <w:r>
-        <w:rPr>
-          <w:rFonts w:ascii="Times New Roman" w:hAnsi="Times New Roman"/>
-          <w:sz w:val="24"/>
-          <w:szCs w:val="24"/>
-          <w:lang w:val="en-GB"/>
-        </w:rPr>
-        <w:t>De Boer</w:t>
-      </w:r>
-      <w:r>
-        <w:rPr>
-          <w:rFonts w:ascii="Times New Roman" w:hAnsi="Times New Roman"/>
-          <w:sz w:val="24"/>
-          <w:szCs w:val="24"/>
-          <w:lang w:val="en-GB"/>
-        </w:rPr>
-        <w:t xml:space="preserve"> decided to work on climate and sustainability issues </w:t>
-      </w:r>
-      <w:r>
-        <w:rPr>
-          <w:rFonts w:ascii="Times New Roman" w:hAnsi="Times New Roman"/>
-          <w:sz w:val="24"/>
-          <w:szCs w:val="24"/>
-          <w:lang w:val="en-GB"/>
-        </w:rPr>
-        <w:t>from</w:t>
-      </w:r>
-      <w:r>
-        <w:rPr>
-          <w:rFonts w:ascii="Times New Roman" w:hAnsi="Times New Roman"/>
-          <w:sz w:val="24"/>
-          <w:szCs w:val="24"/>
-          <w:lang w:val="en-GB"/>
-        </w:rPr>
-        <w:t xml:space="preserve"> </w:t>
-      </w:r>
-      <w:r>
-        <w:rPr>
-          <w:rFonts w:ascii="Times New Roman" w:hAnsi="Times New Roman"/>
-          <w:sz w:val="24"/>
-          <w:szCs w:val="24"/>
-          <w:lang w:val="en-GB"/>
-        </w:rPr>
-        <w:t xml:space="preserve">the perspective of </w:t>
-      </w:r>
-      <w:r>
-        <w:rPr>
-          <w:rFonts w:ascii="Times New Roman" w:hAnsi="Times New Roman"/>
-          <w:sz w:val="24"/>
-          <w:szCs w:val="24"/>
-          <w:lang w:val="en-GB"/>
-        </w:rPr>
-        <w:t>the private sector. After his resignation</w:t>
-      </w:r>
-      <w:r>
-        <w:rPr>
-          <w:rFonts w:ascii="Times New Roman" w:hAnsi="Times New Roman"/>
-          <w:sz w:val="24"/>
-          <w:szCs w:val="24"/>
-          <w:lang w:val="en-GB"/>
-        </w:rPr>
-        <w:t xml:space="preserve"> </w:t>
-      </w:r>
-      <w:r>
-        <w:rPr>
-          <w:rFonts w:ascii="Times New Roman" w:hAnsi="Times New Roman"/>
-          <w:sz w:val="24"/>
-          <w:szCs w:val="24"/>
-          <w:lang w:val="en-GB"/>
-        </w:rPr>
-        <w:t xml:space="preserve">he worked as </w:t>
-      </w:r>
-      <w:r>
-        <w:rPr>
-          <w:rFonts w:ascii="Times New Roman" w:hAnsi="Times New Roman"/>
-          <w:sz w:val="24"/>
-          <w:szCs w:val="24"/>
-          <w:lang w:val="en-GB"/>
-        </w:rPr>
-        <w:t xml:space="preserve">Special </w:t>
-      </w:r>
-      <w:r>
-        <w:rPr>
-          <w:rFonts w:ascii="Times New Roman" w:hAnsi="Times New Roman"/>
-          <w:sz w:val="24"/>
-          <w:szCs w:val="24"/>
-          <w:lang w:val="en-GB"/>
-        </w:rPr>
-        <w:t xml:space="preserve">Global </w:t>
-      </w:r>
-      <w:r>
-        <w:rPr>
-          <w:rFonts w:ascii="Times New Roman" w:hAnsi="Times New Roman"/>
-          <w:sz w:val="24"/>
-          <w:szCs w:val="24"/>
-          <w:lang w:val="en-GB"/>
-        </w:rPr>
-        <w:t xml:space="preserve">Advisor on </w:t>
-      </w:r>
-      <w:r>
-        <w:rPr>
-          <w:rFonts w:ascii="Times New Roman" w:hAnsi="Times New Roman"/>
-          <w:sz w:val="24"/>
-          <w:szCs w:val="24"/>
-          <w:lang w:val="en-GB"/>
-        </w:rPr>
-        <w:t xml:space="preserve">Climate Change and Sustainability at </w:t>
-      </w:r>
-      <w:r>
-        <w:rPr>
-          <w:rFonts w:ascii="Times New Roman" w:hAnsi="Times New Roman"/>
-          <w:sz w:val="24"/>
-          <w:szCs w:val="24"/>
-          <w:lang w:val="en-GB"/>
-        </w:rPr>
-        <w:t xml:space="preserve">the global auditing firm KPMG from </w:t>
-      </w:r>
-      <w:r>
-        <w:rPr>
-          <w:rFonts w:ascii="Times New Roman" w:hAnsi="Times New Roman"/>
-          <w:sz w:val="24"/>
-          <w:szCs w:val="24"/>
-          <w:lang w:val="en-GB"/>
-        </w:rPr>
-        <w:t xml:space="preserve">July </w:t>
-      </w:r>
-      <w:r>
-        <w:rPr>
-          <w:rFonts w:ascii="Times New Roman" w:hAnsi="Times New Roman"/>
-          <w:sz w:val="24"/>
-          <w:szCs w:val="24"/>
-          <w:lang w:val="en-GB"/>
-        </w:rPr>
-        <w:t xml:space="preserve">2010 to </w:t>
-      </w:r>
-      <w:r>
-        <w:rPr>
-          <w:rFonts w:ascii="Times New Roman" w:hAnsi="Times New Roman"/>
-          <w:sz w:val="24"/>
-          <w:szCs w:val="24"/>
-          <w:lang w:val="en-GB"/>
-        </w:rPr>
-        <w:t xml:space="preserve">May </w:t>
-      </w:r>
-      <w:r>
-        <w:rPr>
-          <w:rFonts w:ascii="Times New Roman" w:hAnsi="Times New Roman"/>
-          <w:sz w:val="24"/>
-          <w:szCs w:val="24"/>
-          <w:lang w:val="en-GB"/>
-        </w:rPr>
         <w:t>2014.</w:t>
       </w:r>
       <w:r>
@@ -10946,7 +10903,6 @@
           <w:szCs w:val="24"/>
           <w:lang w:val="en-GB"/>
         </w:rPr>
-        <w:lastRenderedPageBreak/>
         <w:t>Co-C</w:t>
       </w:r>
       <w:r>
@@ -11901,7 +11857,7 @@
         </w:rPr>
         <w:t xml:space="preserve">, Press Release United Nations Environment Programme, 10 August 2006, available at </w:t>
       </w:r>
-      <w:hyperlink r:id="rId10" w:history="1">
+      <w:hyperlink r:id="rId8" w:history="1">
         <w:r>
           <w:rPr>
             <w:rStyle w:val="Hyperlink"/>
@@ -12318,7 +12274,7 @@
         </w:rPr>
         <w:t xml:space="preserve"> </w:t>
       </w:r>
-      <w:hyperlink r:id="rId11" w:history="1">
+      <w:hyperlink r:id="rId9" w:history="1">
         <w:r>
           <w:rPr>
             <w:rStyle w:val="Hyperlink"/>
@@ -12369,7 +12325,7 @@
         </w:rPr>
         <w:t xml:space="preserve">, 11 November 2009, available at </w:t>
       </w:r>
-      <w:hyperlink r:id="rId12" w:history="1">
+      <w:hyperlink r:id="rId10" w:history="1">
         <w:r>
           <w:rPr>
             <w:rStyle w:val="Hyperlink"/>
@@ -12561,7 +12517,7 @@
         </w:rPr>
         <w:t xml:space="preserve"> </w:t>
       </w:r>
-      <w:hyperlink r:id="rId13" w:history="1">
+      <w:hyperlink r:id="rId11" w:history="1">
         <w:r>
           <w:rPr>
             <w:rStyle w:val="Hyperlink"/>
@@ -12626,7 +12582,7 @@
         </w:rPr>
         <w:t xml:space="preserve">‘Yvo de Boer Resigns as Top UN Climate Official’ at BBC, 18 February 2010, available at </w:t>
       </w:r>
-      <w:hyperlink r:id="rId14" w:history="1">
+      <w:hyperlink r:id="rId12" w:history="1">
         <w:r>
           <w:rPr>
             <w:rStyle w:val="Hyperlink"/>
@@ -12677,7 +12633,7 @@
         </w:rPr>
         <w:t xml:space="preserve">, 18 February 2010, available at </w:t>
       </w:r>
-      <w:hyperlink r:id="rId15" w:history="1">
+      <w:hyperlink r:id="rId13" w:history="1">
         <w:r>
           <w:rPr>
             <w:rStyle w:val="Hyperlink"/>
@@ -12774,7 +12730,7 @@
         </w:rPr>
         <w:t xml:space="preserve">, 18 February 2010, available at </w:t>
       </w:r>
-      <w:hyperlink r:id="rId16" w:history="1">
+      <w:hyperlink r:id="rId14" w:history="1">
         <w:r>
           <w:rPr>
             <w:rStyle w:val="Hyperlink"/>
@@ -12869,7 +12825,7 @@
         </w:rPr>
         <w:t xml:space="preserve"> at </w:t>
       </w:r>
-      <w:hyperlink r:id="rId17" w:history="1">
+      <w:hyperlink r:id="rId15" w:history="1">
         <w:r>
           <w:rPr>
             <w:rStyle w:val="Hyperlink"/>
@@ -13036,7 +12992,7 @@
         </w:rPr>
         <w:t xml:space="preserve"> at </w:t>
       </w:r>
-      <w:hyperlink r:id="rId18" w:history="1">
+      <w:hyperlink r:id="rId16" w:history="1">
         <w:r>
           <w:rPr>
             <w:rStyle w:val="Hyperlink"/>
@@ -13076,18 +13032,7 @@
           <w:szCs w:val="24"/>
           <w:lang w:val="en-GB"/>
         </w:rPr>
-        <w:t xml:space="preserve">How Effective Negotiation Management Promotes Multilateral </w:t>
-      </w:r>
-      <w:r>
-        <w:rPr>
-          <w:rFonts w:ascii="Times New Roman" w:hAnsi="Times New Roman"/>
-          <w:i/>
-          <w:sz w:val="24"/>
-          <w:szCs w:val="24"/>
-          <w:lang w:val="en-GB"/>
-        </w:rPr>
-        <w:lastRenderedPageBreak/>
-        <w:t>Cooperation</w:t>
+        <w:t>How Effective Negotiation Management Promotes Multilateral Cooperation</w:t>
       </w:r>
       <w:r>
         <w:rPr>
@@ -13170,7 +13115,7 @@
         </w:rPr>
         <w:t xml:space="preserve"> at </w:t>
       </w:r>
-      <w:hyperlink r:id="rId19" w:history="1">
+      <w:hyperlink r:id="rId17" w:history="1">
         <w:r>
           <w:rPr>
             <w:rStyle w:val="Hyperlink"/>
@@ -13485,7 +13430,7 @@
         </w:rPr>
         <w:t xml:space="preserve">Eisenberg, </w:t>
       </w:r>
-      <w:hyperlink r:id="rId20" w:history="1">
+      <w:hyperlink r:id="rId18" w:history="1">
         <w:r>
           <w:rPr>
             <w:rStyle w:val="Hyperlink"/>
@@ -13534,8 +13479,8 @@
       </w:pPr>
     </w:p>
     <w:sectPr>
-      <w:headerReference w:type="default" r:id="rId21"/>
-      <w:footerReference w:type="default" r:id="rId22"/>
+      <w:headerReference w:type="default" r:id="rId19"/>
+      <w:footerReference w:type="default" r:id="rId20"/>
       <w:pgSz w:w="11906" w:h="16838"/>
       <w:pgMar w:top="1418" w:right="1418" w:bottom="1418" w:left="1418" w:header="709" w:footer="709" w:gutter="0"/>
       <w:cols w:space="720"/>
@@ -13546,7 +13491,7 @@
 </file>
 
 <file path=word/endnotes.xml><?xml version="1.0" encoding="utf-8"?>
-<w:endnotes xmlns:wpc="http://schemas.microsoft.com/office/word/2010/wordprocessingCanvas" xmlns:cx="http://schemas.microsoft.com/office/drawing/2014/chartex" xmlns:cx1="http://schemas.microsoft.com/office/drawing/2015/9/8/chartex" xmlns:cx2="http://schemas.microsoft.com/office/drawing/2015/10/21/chartex" xmlns:cx3="http://schemas.microsoft.com/office/drawing/2016/5/9/chartex" xmlns:cx4="http://schemas.microsoft.com/office/drawing/2016/5/10/chartex" xmlns:cx5="http://schemas.microsoft.com/office/drawing/2016/5/11/chartex" xmlns:cx6="http://schemas.microsoft.com/office/drawing/2016/5/12/chartex" xmlns:cx7="http://schemas.microsoft.com/office/drawing/2016/5/13/chartex" xmlns:cx8="http://schemas.microsoft.com/office/drawing/2016/5/14/chartex" xmlns:mc="http://schemas.openxmlformats.org/markup-compatibility/2006" xmlns:aink="http://schemas.microsoft.com/office/drawing/2016/ink" xmlns:am3d="http://schemas.microsoft.com/office/drawing/2017/model3d" xmlns:o="urn:schemas-microsoft-com:office:office" xmlns:oel="http://schemas.microsoft.com/office/2019/extlst" xmlns:r="http://schemas.openxmlformats.org/officeDocument/2006/relationships" xmlns:m="http://schemas.openxmlformats.org/officeDocument/2006/math" xmlns:v="urn:schemas-microsoft-com:vml" xmlns:wp14="http://schemas.microsoft.com/office/word/2010/wordprocessingDrawing" xmlns:wp="http://schemas.openxmlformats.org/drawingml/2006/wordprocessingDrawing" xmlns:w10="urn:schemas-microsoft-com:office:word" xmlns:w="http://schemas.openxmlformats.org/wordprocessingml/2006/main" xmlns:w14="http://schemas.microsoft.com/office/word/2010/wordml" xmlns:w15="http://schemas.microsoft.com/office/word/2012/wordml" xmlns:w16cex="http://schemas.microsoft.com/office/word/2018/wordml/cex" xmlns:w16cid="http://schemas.microsoft.com/office/word/2016/wordml/cid" xmlns:w16="http://schemas.microsoft.com/office/word/2018/wordml" xmlns:w16du="http://schemas.microsoft.com/office/word/2023/wordml/word16du" xmlns:w16sdtdh="http://schemas.microsoft.com/office/word/2020/wordml/sdtdatahash" xmlns:w16sdtfl="http://schemas.microsoft.com/office/word/2024/wordml/sdtformatlock" xmlns:w16se="http://schemas.microsoft.com/office/word/2015/wordml/symex" xmlns:wpg="http://schemas.microsoft.com/office/word/2010/wordprocessingGroup" xmlns:wpi="http://schemas.microsoft.com/office/word/2010/wordprocessingInk" xmlns:wne="http://schemas.microsoft.com/office/word/2006/wordml" xmlns:wps="http://schemas.microsoft.com/office/word/2010/wordprocessingShape" mc:Ignorable="w14 w15 w16se w16cid w16 w16cex w16sdtdh w16sdtfl w16du wp14">
+<w:endnotes xmlns:wpc="http://schemas.microsoft.com/office/word/2010/wordprocessingCanvas" xmlns:cx="http://schemas.microsoft.com/office/drawing/2014/chartex" xmlns:cx1="http://schemas.microsoft.com/office/drawing/2015/9/8/chartex" xmlns:cx2="http://schemas.microsoft.com/office/drawing/2015/10/21/chartex" xmlns:cx3="http://schemas.microsoft.com/office/drawing/2016/5/9/chartex" xmlns:cx4="http://schemas.microsoft.com/office/drawing/2016/5/10/chartex" xmlns:cx5="http://schemas.microsoft.com/office/drawing/2016/5/11/chartex" xmlns:cx6="http://schemas.microsoft.com/office/drawing/2016/5/12/chartex" xmlns:cx7="http://schemas.microsoft.com/office/drawing/2016/5/13/chartex" xmlns:cx8="http://schemas.microsoft.com/office/drawing/2016/5/14/chartex" xmlns:mc="http://schemas.openxmlformats.org/markup-compatibility/2006" xmlns:m="http://schemas.openxmlformats.org/officeDocument/2006/math" xmlns:aink="http://schemas.microsoft.com/office/drawing/2016/ink" xmlns:am3d="http://schemas.microsoft.com/office/drawing/2017/model3d" xmlns:oel="http://schemas.microsoft.com/office/2019/extlst" xmlns:r="http://schemas.openxmlformats.org/officeDocument/2006/relationships" xmlns:wp14="http://schemas.microsoft.com/office/word/2010/wordprocessingDrawing" xmlns:wp="http://schemas.openxmlformats.org/drawingml/2006/wordprocessingDrawing" xmlns:wpg="http://schemas.microsoft.com/office/word/2010/wordprocessingGroup" xmlns:wpi="http://schemas.microsoft.com/office/word/2010/wordprocessingInk" xmlns:wps="http://schemas.microsoft.com/office/word/2010/wordprocessingShape" xmlns:o="urn:schemas-microsoft-com:office:office" xmlns:v="urn:schemas-microsoft-com:vml" xmlns:w10="urn:schemas-microsoft-com:office:word" xmlns:w="http://schemas.openxmlformats.org/wordprocessingml/2006/main" xmlns:w14="http://schemas.microsoft.com/office/word/2010/wordml" xmlns:w15="http://schemas.microsoft.com/office/word/2012/wordml" xmlns:w16cei="http://schemas.microsoft.com/office/word/2026/wordml/cei" xmlns:w16cex="http://schemas.microsoft.com/office/word/2018/wordml/cex" xmlns:w16cid="http://schemas.microsoft.com/office/word/2016/wordml/cid" xmlns:w16="http://schemas.microsoft.com/office/word/2018/wordml" xmlns:w16sdtdh="http://schemas.microsoft.com/office/word/2020/wordml/sdtdatahash" xmlns:w16sdtfl="http://schemas.microsoft.com/office/word/2024/wordml/sdtformatlock" xmlns:w16se="http://schemas.microsoft.com/office/word/2015/wordml/symex" xmlns:w16du="http://schemas.microsoft.com/office/word/2023/wordml/word16du" xmlns:wne="http://schemas.microsoft.com/office/word/2006/wordml" mc:Ignorable="w14 w15 w16se w16cid w16 w16cex w16sdtdh w16sdtfl w16du wp14">
   <w:endnote w:type="separator" w:id="-1">
     <w:p>
       <w:pPr>
@@ -13571,7 +13516,7 @@
 </file>
 
 <file path=word/footer1.xml><?xml version="1.0" encoding="utf-8"?>
-<w:ftr xmlns:wpc="http://schemas.microsoft.com/office/word/2010/wordprocessingCanvas" xmlns:cx="http://schemas.microsoft.com/office/drawing/2014/chartex" xmlns:cx1="http://schemas.microsoft.com/office/drawing/2015/9/8/chartex" xmlns:cx2="http://schemas.microsoft.com/office/drawing/2015/10/21/chartex" xmlns:cx3="http://schemas.microsoft.com/office/drawing/2016/5/9/chartex" xmlns:cx4="http://schemas.microsoft.com/office/drawing/2016/5/10/chartex" xmlns:cx5="http://schemas.microsoft.com/office/drawing/2016/5/11/chartex" xmlns:cx6="http://schemas.microsoft.com/office/drawing/2016/5/12/chartex" xmlns:cx7="http://schemas.microsoft.com/office/drawing/2016/5/13/chartex" xmlns:cx8="http://schemas.microsoft.com/office/drawing/2016/5/14/chartex" xmlns:mc="http://schemas.openxmlformats.org/markup-compatibility/2006" xmlns:aink="http://schemas.microsoft.com/office/drawing/2016/ink" xmlns:am3d="http://schemas.microsoft.com/office/drawing/2017/model3d" xmlns:o="urn:schemas-microsoft-com:office:office" xmlns:oel="http://schemas.microsoft.com/office/2019/extlst" xmlns:r="http://schemas.openxmlformats.org/officeDocument/2006/relationships" xmlns:m="http://schemas.openxmlformats.org/officeDocument/2006/math" xmlns:v="urn:schemas-microsoft-com:vml" xmlns:wp14="http://schemas.microsoft.com/office/word/2010/wordprocessingDrawing" xmlns:wp="http://schemas.openxmlformats.org/drawingml/2006/wordprocessingDrawing" xmlns:w10="urn:schemas-microsoft-com:office:word" xmlns:w="http://schemas.openxmlformats.org/wordprocessingml/2006/main" xmlns:w14="http://schemas.microsoft.com/office/word/2010/wordml" xmlns:w15="http://schemas.microsoft.com/office/word/2012/wordml" xmlns:w16cex="http://schemas.microsoft.com/office/word/2018/wordml/cex" xmlns:w16cid="http://schemas.microsoft.com/office/word/2016/wordml/cid" xmlns:w16="http://schemas.microsoft.com/office/word/2018/wordml" xmlns:w16du="http://schemas.microsoft.com/office/word/2023/wordml/word16du" xmlns:w16sdtdh="http://schemas.microsoft.com/office/word/2020/wordml/sdtdatahash" xmlns:w16sdtfl="http://schemas.microsoft.com/office/word/2024/wordml/sdtformatlock" xmlns:w16se="http://schemas.microsoft.com/office/word/2015/wordml/symex" xmlns:wpg="http://schemas.microsoft.com/office/word/2010/wordprocessingGroup" xmlns:wpi="http://schemas.microsoft.com/office/word/2010/wordprocessingInk" xmlns:wne="http://schemas.microsoft.com/office/word/2006/wordml" xmlns:wps="http://schemas.microsoft.com/office/word/2010/wordprocessingShape" mc:Ignorable="w14 w15 w16se w16cid w16 w16cex w16sdtdh w16sdtfl w16du wp14">
+<w:ftr xmlns:wpc="http://schemas.microsoft.com/office/word/2010/wordprocessingCanvas" xmlns:cx="http://schemas.microsoft.com/office/drawing/2014/chartex" xmlns:cx1="http://schemas.microsoft.com/office/drawing/2015/9/8/chartex" xmlns:cx2="http://schemas.microsoft.com/office/drawing/2015/10/21/chartex" xmlns:cx3="http://schemas.microsoft.com/office/drawing/2016/5/9/chartex" xmlns:cx4="http://schemas.microsoft.com/office/drawing/2016/5/10/chartex" xmlns:cx5="http://schemas.microsoft.com/office/drawing/2016/5/11/chartex" xmlns:cx6="http://schemas.microsoft.com/office/drawing/2016/5/12/chartex" xmlns:cx7="http://schemas.microsoft.com/office/drawing/2016/5/13/chartex" xmlns:cx8="http://schemas.microsoft.com/office/drawing/2016/5/14/chartex" xmlns:mc="http://schemas.openxmlformats.org/markup-compatibility/2006" xmlns:m="http://schemas.openxmlformats.org/officeDocument/2006/math" xmlns:aink="http://schemas.microsoft.com/office/drawing/2016/ink" xmlns:am3d="http://schemas.microsoft.com/office/drawing/2017/model3d" xmlns:oel="http://schemas.microsoft.com/office/2019/extlst" xmlns:r="http://schemas.openxmlformats.org/officeDocument/2006/relationships" xmlns:wp14="http://schemas.microsoft.com/office/word/2010/wordprocessingDrawing" xmlns:wp="http://schemas.openxmlformats.org/drawingml/2006/wordprocessingDrawing" xmlns:wpg="http://schemas.microsoft.com/office/word/2010/wordprocessingGroup" xmlns:wpi="http://schemas.microsoft.com/office/word/2010/wordprocessingInk" xmlns:wps="http://schemas.microsoft.com/office/word/2010/wordprocessingShape" xmlns:o="urn:schemas-microsoft-com:office:office" xmlns:v="urn:schemas-microsoft-com:vml" xmlns:w10="urn:schemas-microsoft-com:office:word" xmlns:w="http://schemas.openxmlformats.org/wordprocessingml/2006/main" xmlns:w14="http://schemas.microsoft.com/office/word/2010/wordml" xmlns:w15="http://schemas.microsoft.com/office/word/2012/wordml" xmlns:w16cei="http://schemas.microsoft.com/office/word/2026/wordml/cei" xmlns:w16cex="http://schemas.microsoft.com/office/word/2018/wordml/cex" xmlns:w16cid="http://schemas.microsoft.com/office/word/2016/wordml/cid" xmlns:w16="http://schemas.microsoft.com/office/word/2018/wordml" xmlns:w16sdtdh="http://schemas.microsoft.com/office/word/2020/wordml/sdtdatahash" xmlns:w16sdtfl="http://schemas.microsoft.com/office/word/2024/wordml/sdtformatlock" xmlns:w16se="http://schemas.microsoft.com/office/word/2015/wordml/symex" xmlns:w16du="http://schemas.microsoft.com/office/word/2023/wordml/word16du" xmlns:wne="http://schemas.microsoft.com/office/word/2006/wordml" mc:Ignorable="w14 w15 w16se w16cid w16 w16cex w16sdtdh w16sdtfl w16du wp14">
   <w:p>
     <w:pPr>
       <w:pStyle w:val="Voettekst"/>
@@ -13628,7 +13573,7 @@
 </file>
 
 <file path=word/footnotes.xml><?xml version="1.0" encoding="utf-8"?>
-<w:footnotes xmlns:wpc="http://schemas.microsoft.com/office/word/2010/wordprocessingCanvas" xmlns:cx="http://schemas.microsoft.com/office/drawing/2014/chartex" xmlns:cx1="http://schemas.microsoft.com/office/drawing/2015/9/8/chartex" xmlns:cx2="http://schemas.microsoft.com/office/drawing/2015/10/21/chartex" xmlns:cx3="http://schemas.microsoft.com/office/drawing/2016/5/9/chartex" xmlns:cx4="http://schemas.microsoft.com/office/drawing/2016/5/10/chartex" xmlns:cx5="http://schemas.microsoft.com/office/drawing/2016/5/11/chartex" xmlns:cx6="http://schemas.microsoft.com/office/drawing/2016/5/12/chartex" xmlns:cx7="http://schemas.microsoft.com/office/drawing/2016/5/13/chartex" xmlns:cx8="http://schemas.microsoft.com/office/drawing/2016/5/14/chartex" xmlns:mc="http://schemas.openxmlformats.org/markup-compatibility/2006" xmlns:aink="http://schemas.microsoft.com/office/drawing/2016/ink" xmlns:am3d="http://schemas.microsoft.com/office/drawing/2017/model3d" xmlns:o="urn:schemas-microsoft-com:office:office" xmlns:oel="http://schemas.microsoft.com/office/2019/extlst" xmlns:r="http://schemas.openxmlformats.org/officeDocument/2006/relationships" xmlns:m="http://schemas.openxmlformats.org/officeDocument/2006/math" xmlns:v="urn:schemas-microsoft-com:vml" xmlns:wp14="http://schemas.microsoft.com/office/word/2010/wordprocessingDrawing" xmlns:wp="http://schemas.openxmlformats.org/drawingml/2006/wordprocessingDrawing" xmlns:w10="urn:schemas-microsoft-com:office:word" xmlns:w="http://schemas.openxmlformats.org/wordprocessingml/2006/main" xmlns:w14="http://schemas.microsoft.com/office/word/2010/wordml" xmlns:w15="http://schemas.microsoft.com/office/word/2012/wordml" xmlns:w16cex="http://schemas.microsoft.com/office/word/2018/wordml/cex" xmlns:w16cid="http://schemas.microsoft.com/office/word/2016/wordml/cid" xmlns:w16="http://schemas.microsoft.com/office/word/2018/wordml" xmlns:w16du="http://schemas.microsoft.com/office/word/2023/wordml/word16du" xmlns:w16sdtdh="http://schemas.microsoft.com/office/word/2020/wordml/sdtdatahash" xmlns:w16sdtfl="http://schemas.microsoft.com/office/word/2024/wordml/sdtformatlock" xmlns:w16se="http://schemas.microsoft.com/office/word/2015/wordml/symex" xmlns:wpg="http://schemas.microsoft.com/office/word/2010/wordprocessingGroup" xmlns:wpi="http://schemas.microsoft.com/office/word/2010/wordprocessingInk" xmlns:wne="http://schemas.microsoft.com/office/word/2006/wordml" xmlns:wps="http://schemas.microsoft.com/office/word/2010/wordprocessingShape" mc:Ignorable="w14 w15 w16se w16cid w16 w16cex w16sdtdh w16sdtfl w16du wp14">
+<w:footnotes xmlns:wpc="http://schemas.microsoft.com/office/word/2010/wordprocessingCanvas" xmlns:cx="http://schemas.microsoft.com/office/drawing/2014/chartex" xmlns:cx1="http://schemas.microsoft.com/office/drawing/2015/9/8/chartex" xmlns:cx2="http://schemas.microsoft.com/office/drawing/2015/10/21/chartex" xmlns:cx3="http://schemas.microsoft.com/office/drawing/2016/5/9/chartex" xmlns:cx4="http://schemas.microsoft.com/office/drawing/2016/5/10/chartex" xmlns:cx5="http://schemas.microsoft.com/office/drawing/2016/5/11/chartex" xmlns:cx6="http://schemas.microsoft.com/office/drawing/2016/5/12/chartex" xmlns:cx7="http://schemas.microsoft.com/office/drawing/2016/5/13/chartex" xmlns:cx8="http://schemas.microsoft.com/office/drawing/2016/5/14/chartex" xmlns:mc="http://schemas.openxmlformats.org/markup-compatibility/2006" xmlns:m="http://schemas.openxmlformats.org/officeDocument/2006/math" xmlns:aink="http://schemas.microsoft.com/office/drawing/2016/ink" xmlns:am3d="http://schemas.microsoft.com/office/drawing/2017/model3d" xmlns:oel="http://schemas.microsoft.com/office/2019/extlst" xmlns:r="http://schemas.openxmlformats.org/officeDocument/2006/relationships" xmlns:wp14="http://schemas.microsoft.com/office/word/2010/wordprocessingDrawing" xmlns:wp="http://schemas.openxmlformats.org/drawingml/2006/wordprocessingDrawing" xmlns:wpg="http://schemas.microsoft.com/office/word/2010/wordprocessingGroup" xmlns:wpi="http://schemas.microsoft.com/office/word/2010/wordprocessingInk" xmlns:wps="http://schemas.microsoft.com/office/word/2010/wordprocessingShape" xmlns:o="urn:schemas-microsoft-com:office:office" xmlns:v="urn:schemas-microsoft-com:vml" xmlns:w10="urn:schemas-microsoft-com:office:word" xmlns:w="http://schemas.openxmlformats.org/wordprocessingml/2006/main" xmlns:w14="http://schemas.microsoft.com/office/word/2010/wordml" xmlns:w15="http://schemas.microsoft.com/office/word/2012/wordml" xmlns:w16cei="http://schemas.microsoft.com/office/word/2026/wordml/cei" xmlns:w16cex="http://schemas.microsoft.com/office/word/2018/wordml/cex" xmlns:w16cid="http://schemas.microsoft.com/office/word/2016/wordml/cid" xmlns:w16="http://schemas.microsoft.com/office/word/2018/wordml" xmlns:w16sdtdh="http://schemas.microsoft.com/office/word/2020/wordml/sdtdatahash" xmlns:w16sdtfl="http://schemas.microsoft.com/office/word/2024/wordml/sdtformatlock" xmlns:w16se="http://schemas.microsoft.com/office/word/2015/wordml/symex" xmlns:w16du="http://schemas.microsoft.com/office/word/2023/wordml/word16du" xmlns:wne="http://schemas.microsoft.com/office/word/2006/wordml" mc:Ignorable="w14 w15 w16se w16cid w16 w16cex w16sdtdh w16sdtfl w16du wp14">
   <w:footnote w:type="separator" w:id="-1">
     <w:p>
       <w:pPr>
@@ -13653,7 +13598,7 @@
 </file>
 
 <file path=word/header1.xml><?xml version="1.0" encoding="utf-8"?>
-<w:hdr xmlns:wpc="http://schemas.microsoft.com/office/word/2010/wordprocessingCanvas" xmlns:cx="http://schemas.microsoft.com/office/drawing/2014/chartex" xmlns:cx1="http://schemas.microsoft.com/office/drawing/2015/9/8/chartex" xmlns:cx2="http://schemas.microsoft.com/office/drawing/2015/10/21/chartex" xmlns:cx3="http://schemas.microsoft.com/office/drawing/2016/5/9/chartex" xmlns:cx4="http://schemas.microsoft.com/office/drawing/2016/5/10/chartex" xmlns:cx5="http://schemas.microsoft.com/office/drawing/2016/5/11/chartex" xmlns:cx6="http://schemas.microsoft.com/office/drawing/2016/5/12/chartex" xmlns:cx7="http://schemas.microsoft.com/office/drawing/2016/5/13/chartex" xmlns:cx8="http://schemas.microsoft.com/office/drawing/2016/5/14/chartex" xmlns:mc="http://schemas.openxmlformats.org/markup-compatibility/2006" xmlns:aink="http://schemas.microsoft.com/office/drawing/2016/ink" xmlns:am3d="http://schemas.microsoft.com/office/drawing/2017/model3d" xmlns:o="urn:schemas-microsoft-com:office:office" xmlns:oel="http://schemas.microsoft.com/office/2019/extlst" xmlns:r="http://schemas.openxmlformats.org/officeDocument/2006/relationships" xmlns:m="http://schemas.openxmlformats.org/officeDocument/2006/math" xmlns:v="urn:schemas-microsoft-com:vml" xmlns:wp14="http://schemas.microsoft.com/office/word/2010/wordprocessingDrawing" xmlns:wp="http://schemas.openxmlformats.org/drawingml/2006/wordprocessingDrawing" xmlns:w10="urn:schemas-microsoft-com:office:word" xmlns:w="http://schemas.openxmlformats.org/wordprocessingml/2006/main" xmlns:w14="http://schemas.microsoft.com/office/word/2010/wordml" xmlns:w15="http://schemas.microsoft.com/office/word/2012/wordml" xmlns:w16cex="http://schemas.microsoft.com/office/word/2018/wordml/cex" xmlns:w16cid="http://schemas.microsoft.com/office/word/2016/wordml/cid" xmlns:w16="http://schemas.microsoft.com/office/word/2018/wordml" xmlns:w16du="http://schemas.microsoft.com/office/word/2023/wordml/word16du" xmlns:w16sdtdh="http://schemas.microsoft.com/office/word/2020/wordml/sdtdatahash" xmlns:w16sdtfl="http://schemas.microsoft.com/office/word/2024/wordml/sdtformatlock" xmlns:w16se="http://schemas.microsoft.com/office/word/2015/wordml/symex" xmlns:wpg="http://schemas.microsoft.com/office/word/2010/wordprocessingGroup" xmlns:wpi="http://schemas.microsoft.com/office/word/2010/wordprocessingInk" xmlns:wne="http://schemas.microsoft.com/office/word/2006/wordml" xmlns:wps="http://schemas.microsoft.com/office/word/2010/wordprocessingShape" mc:Ignorable="w14 w15 w16se w16cid w16 w16cex w16sdtdh w16sdtfl w16du wp14">
+<w:hdr xmlns:wpc="http://schemas.microsoft.com/office/word/2010/wordprocessingCanvas" xmlns:cx="http://schemas.microsoft.com/office/drawing/2014/chartex" xmlns:cx1="http://schemas.microsoft.com/office/drawing/2015/9/8/chartex" xmlns:cx2="http://schemas.microsoft.com/office/drawing/2015/10/21/chartex" xmlns:cx3="http://schemas.microsoft.com/office/drawing/2016/5/9/chartex" xmlns:cx4="http://schemas.microsoft.com/office/drawing/2016/5/10/chartex" xmlns:cx5="http://schemas.microsoft.com/office/drawing/2016/5/11/chartex" xmlns:cx6="http://schemas.microsoft.com/office/drawing/2016/5/12/chartex" xmlns:cx7="http://schemas.microsoft.com/office/drawing/2016/5/13/chartex" xmlns:cx8="http://schemas.microsoft.com/office/drawing/2016/5/14/chartex" xmlns:mc="http://schemas.openxmlformats.org/markup-compatibility/2006" xmlns:m="http://schemas.openxmlformats.org/officeDocument/2006/math" xmlns:aink="http://schemas.microsoft.com/office/drawing/2016/ink" xmlns:am3d="http://schemas.microsoft.com/office/drawing/2017/model3d" xmlns:oel="http://schemas.microsoft.com/office/2019/extlst" xmlns:r="http://schemas.openxmlformats.org/officeDocument/2006/relationships" xmlns:wp14="http://schemas.microsoft.com/office/word/2010/wordprocessingDrawing" xmlns:wp="http://schemas.openxmlformats.org/drawingml/2006/wordprocessingDrawing" xmlns:wpg="http://schemas.microsoft.com/office/word/2010/wordprocessingGroup" xmlns:wpi="http://schemas.microsoft.com/office/word/2010/wordprocessingInk" xmlns:wps="http://schemas.microsoft.com/office/word/2010/wordprocessingShape" xmlns:o="urn:schemas-microsoft-com:office:office" xmlns:v="urn:schemas-microsoft-com:vml" xmlns:w10="urn:schemas-microsoft-com:office:word" xmlns:w="http://schemas.openxmlformats.org/wordprocessingml/2006/main" xmlns:w14="http://schemas.microsoft.com/office/word/2010/wordml" xmlns:w15="http://schemas.microsoft.com/office/word/2012/wordml" xmlns:w16cei="http://schemas.microsoft.com/office/word/2026/wordml/cei" xmlns:w16cex="http://schemas.microsoft.com/office/word/2018/wordml/cex" xmlns:w16cid="http://schemas.microsoft.com/office/word/2016/wordml/cid" xmlns:w16="http://schemas.microsoft.com/office/word/2018/wordml" xmlns:w16sdtdh="http://schemas.microsoft.com/office/word/2020/wordml/sdtdatahash" xmlns:w16sdtfl="http://schemas.microsoft.com/office/word/2024/wordml/sdtformatlock" xmlns:w16se="http://schemas.microsoft.com/office/word/2015/wordml/symex" xmlns:w16du="http://schemas.microsoft.com/office/word/2023/wordml/word16du" xmlns:wne="http://schemas.microsoft.com/office/word/2006/wordml" mc:Ignorable="w14 w15 w16se w16cid w16 w16cex w16sdtdh w16sdtfl w16du wp14">
   <w:p>
     <w:pPr>
       <w:pStyle w:val="Koptekst"/>
@@ -13696,7 +13641,7 @@
 </file>
 
 <file path=word/styles.xml><?xml version="1.0" encoding="utf-8"?>
-<w:styles xmlns:mc="http://schemas.openxmlformats.org/markup-compatibility/2006" xmlns:r="http://schemas.openxmlformats.org/officeDocument/2006/relationships" xmlns:w="http://schemas.openxmlformats.org/wordprocessingml/2006/main" xmlns:w14="http://schemas.microsoft.com/office/word/2010/wordml" xmlns:w15="http://schemas.microsoft.com/office/word/2012/wordml" xmlns:w16cex="http://schemas.microsoft.com/office/word/2018/wordml/cex" xmlns:w16cid="http://schemas.microsoft.com/office/word/2016/wordml/cid" xmlns:w16="http://schemas.microsoft.com/office/word/2018/wordml" xmlns:w16du="http://schemas.microsoft.com/office/word/2023/wordml/word16du" xmlns:w16sdtdh="http://schemas.microsoft.com/office/word/2020/wordml/sdtdatahash" xmlns:w16sdtfl="http://schemas.microsoft.com/office/word/2024/wordml/sdtformatlock" xmlns:w16se="http://schemas.microsoft.com/office/word/2015/wordml/symex" mc:Ignorable="w14 w15 w16se w16cid w16 w16cex w16sdtdh w16sdtfl w16du">
+<w:styles xmlns:mc="http://schemas.openxmlformats.org/markup-compatibility/2006" xmlns:r="http://schemas.openxmlformats.org/officeDocument/2006/relationships" xmlns:w="http://schemas.openxmlformats.org/wordprocessingml/2006/main" xmlns:w14="http://schemas.microsoft.com/office/word/2010/wordml" xmlns:w15="http://schemas.microsoft.com/office/word/2012/wordml" xmlns:w16cex="http://schemas.microsoft.com/office/word/2018/wordml/cex" xmlns:w16cid="http://schemas.microsoft.com/office/word/2016/wordml/cid" xmlns:w16="http://schemas.microsoft.com/office/word/2018/wordml" xmlns:w16sdtdh="http://schemas.microsoft.com/office/word/2020/wordml/sdtdatahash" xmlns:w16sdtfl="http://schemas.microsoft.com/office/word/2024/wordml/sdtformatlock" xmlns:w16se="http://schemas.microsoft.com/office/word/2015/wordml/symex" xmlns:w16du="http://schemas.microsoft.com/office/word/2023/wordml/word16du" mc:Ignorable="w14 w15 w16se w16cid w16 w16cex w16sdtdh w16sdtfl w16du">
   <w:docDefaults>
     <w:rPrDefault>
       <w:rPr>

</xml_diff>